<commit_message>
removed welcome fron user name on top right
</commit_message>
<xml_diff>
--- a/Group1 Project.docx
+++ b/Group1 Project.docx
@@ -122,13 +122,13 @@
               </wp:anchor>
             </w:drawing>
           </mc:Choice>
-          <mc:Fallback xmlns:cx="http://schemas.microsoft.com/office/drawing/2014/chartex" xmlns:cx1="http://schemas.microsoft.com/office/drawing/2015/9/8/chartex" xmlns:cx2="http://schemas.microsoft.com/office/drawing/2015/10/21/chartex" xmlns:cx3="http://schemas.microsoft.com/office/drawing/2016/5/9/chartex" xmlns:cx4="http://schemas.microsoft.com/office/drawing/2016/5/10/chartex" xmlns:cx5="http://schemas.microsoft.com/office/drawing/2016/5/11/chartex" xmlns:cx6="http://schemas.microsoft.com/office/drawing/2016/5/12/chartex" xmlns:cx7="http://schemas.microsoft.com/office/drawing/2016/5/13/chartex" xmlns:cx8="http://schemas.microsoft.com/office/drawing/2016/5/14/chartex" xmlns:aink="http://schemas.microsoft.com/office/drawing/2016/ink" xmlns:am3d="http://schemas.microsoft.com/office/drawing/2017/model3d" xmlns:oel="http://schemas.microsoft.com/office/2019/extlst" xmlns:w15="http://schemas.microsoft.com/office/word/2012/wordml" xmlns:w16cei="http://schemas.microsoft.com/office/word/2026/wordml/cei" xmlns:w16cex="http://schemas.microsoft.com/office/word/2018/wordml/cex" xmlns:w16cid="http://schemas.microsoft.com/office/word/2016/wordml/cid" xmlns:w16="http://schemas.microsoft.com/office/word/2018/wordml" xmlns:w16du="http://schemas.microsoft.com/office/word/2023/wordml/word16du" xmlns:w16sdtdh="http://schemas.microsoft.com/office/word/2020/wordml/sdtdatahash" xmlns:w16sdtfl="http://schemas.microsoft.com/office/word/2024/wordml/sdtformatlock" xmlns:w16se="http://schemas.microsoft.com/office/word/2015/wordml/symex">
+          <mc:Fallback>
             <w:pict>
-              <v:shapetype w14:anchorId="229C05D0" id="_x0000_t202" coordsize="21600,21600" o:spt="202" path="m,l,21600r21600,l21600,xe">
+              <v:shapetype id="_x0000_t202" coordsize="21600,21600" o:spt="202" path="m,l,21600r21600,l21600,xe">
                 <v:stroke joinstyle="miter"/>
                 <v:path gradientshapeok="t" o:connecttype="rect"/>
               </v:shapetype>
-              <v:shape id="Text Box 7" o:spid="_x0000_s1026" type="#_x0000_t202" style="position:absolute;margin-left:155.25pt;margin-top:671.4pt;width:75.75pt;height:19.5pt;z-index:251662336;visibility:visible;mso-wrap-style:square;mso-height-percent:0;mso-wrap-distance-left:9pt;mso-wrap-distance-top:0;mso-wrap-distance-right:9pt;mso-wrap-distance-bottom:0;mso-position-horizontal:absolute;mso-position-horizontal-relative:text;mso-position-vertical:absolute;mso-position-vertical-relative:text;mso-height-percent:0;mso-height-relative:margin;v-text-anchor:top" o:gfxdata="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" filled="f" stroked="f" strokeweight=".5pt">
+              <v:shape id="Text Box 7" o:spid="_x0000_s1026" type="#_x0000_t202" style="position:absolute;margin-left:155.25pt;margin-top:671.4pt;width:75.75pt;height:19.5pt;z-index:251662336;visibility:visible;mso-wrap-style:square;mso-height-percent:0;mso-wrap-distance-left:9pt;mso-wrap-distance-top:0;mso-wrap-distance-right:9pt;mso-wrap-distance-bottom:0;mso-position-horizontal:absolute;mso-position-horizontal-relative:text;mso-position-vertical:absolute;mso-position-vertical-relative:text;mso-height-percent:0;mso-height-relative:margin;v-text-anchor:top" o:gfxdata="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" filled="f" stroked="f" strokeweight=".5pt">
                 <v:textbox>
                   <w:txbxContent>
                     <w:p>
@@ -304,9 +304,9 @@
               </wp:anchor>
             </w:drawing>
           </mc:Choice>
-          <mc:Fallback xmlns:cx="http://schemas.microsoft.com/office/drawing/2014/chartex" xmlns:cx1="http://schemas.microsoft.com/office/drawing/2015/9/8/chartex" xmlns:cx2="http://schemas.microsoft.com/office/drawing/2015/10/21/chartex" xmlns:cx3="http://schemas.microsoft.com/office/drawing/2016/5/9/chartex" xmlns:cx4="http://schemas.microsoft.com/office/drawing/2016/5/10/chartex" xmlns:cx5="http://schemas.microsoft.com/office/drawing/2016/5/11/chartex" xmlns:cx6="http://schemas.microsoft.com/office/drawing/2016/5/12/chartex" xmlns:cx7="http://schemas.microsoft.com/office/drawing/2016/5/13/chartex" xmlns:cx8="http://schemas.microsoft.com/office/drawing/2016/5/14/chartex" xmlns:aink="http://schemas.microsoft.com/office/drawing/2016/ink" xmlns:am3d="http://schemas.microsoft.com/office/drawing/2017/model3d" xmlns:oel="http://schemas.microsoft.com/office/2019/extlst" xmlns:w15="http://schemas.microsoft.com/office/word/2012/wordml" xmlns:w16cei="http://schemas.microsoft.com/office/word/2026/wordml/cei" xmlns:w16cex="http://schemas.microsoft.com/office/word/2018/wordml/cex" xmlns:w16cid="http://schemas.microsoft.com/office/word/2016/wordml/cid" xmlns:w16="http://schemas.microsoft.com/office/word/2018/wordml" xmlns:w16du="http://schemas.microsoft.com/office/word/2023/wordml/word16du" xmlns:w16sdtdh="http://schemas.microsoft.com/office/word/2020/wordml/sdtdatahash" xmlns:w16sdtfl="http://schemas.microsoft.com/office/word/2024/wordml/sdtformatlock" xmlns:w16se="http://schemas.microsoft.com/office/word/2015/wordml/symex">
+          <mc:Fallback>
             <w:pict>
-              <v:shape w14:anchorId="1496DDD1" id="Text Box 6" o:spid="_x0000_s1027" type="#_x0000_t202" style="position:absolute;margin-left:269.25pt;margin-top:763.65pt;width:153pt;height:106.5pt;z-index:251661312;visibility:visible;mso-wrap-style:square;mso-width-percent:0;mso-height-percent:0;mso-wrap-distance-left:9pt;mso-wrap-distance-top:0;mso-wrap-distance-right:9pt;mso-wrap-distance-bottom:0;mso-position-horizontal:absolute;mso-position-horizontal-relative:text;mso-position-vertical:absolute;mso-position-vertical-relative:text;mso-width-percent:0;mso-height-percent:0;mso-width-relative:margin;mso-height-relative:margin;v-text-anchor:top" o:gfxdata="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" fillcolor="#f8f8f8" stroked="f" strokeweight=".5pt">
+              <v:shape id="Text Box 6" o:spid="_x0000_s1027" type="#_x0000_t202" style="position:absolute;margin-left:269.25pt;margin-top:763.65pt;width:153pt;height:106.5pt;z-index:251661312;visibility:visible;mso-wrap-style:square;mso-width-percent:0;mso-height-percent:0;mso-wrap-distance-left:9pt;mso-wrap-distance-top:0;mso-wrap-distance-right:9pt;mso-wrap-distance-bottom:0;mso-position-horizontal:absolute;mso-position-horizontal-relative:text;mso-position-vertical:absolute;mso-position-vertical-relative:text;mso-width-percent:0;mso-height-percent:0;mso-width-relative:margin;mso-height-relative:margin;v-text-anchor:top" o:gfxdata="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" fillcolor="#f8f8f8" stroked="f" strokeweight=".5pt">
                 <v:textbox>
                   <w:txbxContent>
                     <w:p>
@@ -531,7 +531,7 @@
             </w:rPr>
             <w:fldChar w:fldCharType="separate"/>
           </w:r>
-          <w:hyperlink w:anchor="_Toc236216653" w:history="1">
+          <w:hyperlink w:anchor="_Toc238036122" w:history="1">
             <w:r>
               <w:rPr>
                 <w:rStyle w:val="Hyperlink"/>
@@ -546,6 +546,47 @@
                 <w:webHidden/>
               </w:rPr>
               <w:tab/>
+            </w:r>
+            <w:r>
+              <w:rPr>
+                <w:noProof/>
+                <w:webHidden/>
+              </w:rPr>
+              <w:fldChar w:fldCharType="begin"/>
+            </w:r>
+            <w:r>
+              <w:rPr>
+                <w:noProof/>
+                <w:webHidden/>
+              </w:rPr>
+              <w:instrText xml:space="preserve"> PAGEREF _Toc238036122 \h </w:instrText>
+            </w:r>
+            <w:r>
+              <w:rPr>
+                <w:noProof/>
+                <w:webHidden/>
+              </w:rPr>
+            </w:r>
+            <w:r>
+              <w:rPr>
+                <w:noProof/>
+                <w:webHidden/>
+              </w:rPr>
+              <w:fldChar w:fldCharType="separate"/>
+            </w:r>
+            <w:r>
+              <w:rPr>
+                <w:noProof/>
+                <w:webHidden/>
+              </w:rPr>
+              <w:t>3</w:t>
+            </w:r>
+            <w:r>
+              <w:rPr>
+                <w:noProof/>
+                <w:webHidden/>
+              </w:rPr>
+              <w:fldChar w:fldCharType="end"/>
             </w:r>
           </w:hyperlink>
         </w:p>
@@ -558,7 +599,7 @@
               <w:noProof/>
             </w:rPr>
           </w:pPr>
-          <w:hyperlink w:anchor="_Toc236216654" w:history="1">
+          <w:hyperlink w:anchor="_Toc238036123" w:history="1">
             <w:r>
               <w:rPr>
                 <w:rStyle w:val="Hyperlink"/>
@@ -573,7 +614,47 @@
                 <w:webHidden/>
               </w:rPr>
               <w:tab/>
-              <w:t>1</w:t>
+            </w:r>
+            <w:r>
+              <w:rPr>
+                <w:noProof/>
+                <w:webHidden/>
+              </w:rPr>
+              <w:fldChar w:fldCharType="begin"/>
+            </w:r>
+            <w:r>
+              <w:rPr>
+                <w:noProof/>
+                <w:webHidden/>
+              </w:rPr>
+              <w:instrText xml:space="preserve"> PAGEREF _Toc238036123 \h </w:instrText>
+            </w:r>
+            <w:r>
+              <w:rPr>
+                <w:noProof/>
+                <w:webHidden/>
+              </w:rPr>
+            </w:r>
+            <w:r>
+              <w:rPr>
+                <w:noProof/>
+                <w:webHidden/>
+              </w:rPr>
+              <w:fldChar w:fldCharType="separate"/>
+            </w:r>
+            <w:r>
+              <w:rPr>
+                <w:noProof/>
+                <w:webHidden/>
+              </w:rPr>
+              <w:t>3</w:t>
+            </w:r>
+            <w:r>
+              <w:rPr>
+                <w:noProof/>
+                <w:webHidden/>
+              </w:rPr>
+              <w:fldChar w:fldCharType="end"/>
             </w:r>
           </w:hyperlink>
         </w:p>
@@ -586,14 +667,14 @@
               <w:sz w:val="22"/>
             </w:rPr>
           </w:pPr>
-          <w:hyperlink w:anchor="_Toc236216655" w:history="1">
+          <w:hyperlink w:anchor="_Toc238036124" w:history="1">
             <w:r>
               <w:rPr>
                 <w:rStyle w:val="Hyperlink"/>
                 <w:rFonts w:ascii="Times New Roman" w:hAnsi="Times New Roman" w:cs="Times New Roman"/>
                 <w:noProof/>
               </w:rPr>
-              <w:t>UML</w:t>
+              <w:t>1.1 UML</w:t>
             </w:r>
             <w:r>
               <w:rPr>
@@ -601,7 +682,47 @@
                 <w:webHidden/>
               </w:rPr>
               <w:tab/>
-              <w:t>1.1</w:t>
+            </w:r>
+            <w:r>
+              <w:rPr>
+                <w:noProof/>
+                <w:webHidden/>
+              </w:rPr>
+              <w:fldChar w:fldCharType="begin"/>
+            </w:r>
+            <w:r>
+              <w:rPr>
+                <w:noProof/>
+                <w:webHidden/>
+              </w:rPr>
+              <w:instrText xml:space="preserve"> PAGEREF _Toc238036124 \h </w:instrText>
+            </w:r>
+            <w:r>
+              <w:rPr>
+                <w:noProof/>
+                <w:webHidden/>
+              </w:rPr>
+            </w:r>
+            <w:r>
+              <w:rPr>
+                <w:noProof/>
+                <w:webHidden/>
+              </w:rPr>
+              <w:fldChar w:fldCharType="separate"/>
+            </w:r>
+            <w:r>
+              <w:rPr>
+                <w:noProof/>
+                <w:webHidden/>
+              </w:rPr>
+              <w:t>3</w:t>
+            </w:r>
+            <w:r>
+              <w:rPr>
+                <w:noProof/>
+                <w:webHidden/>
+              </w:rPr>
+              <w:fldChar w:fldCharType="end"/>
             </w:r>
           </w:hyperlink>
         </w:p>
@@ -614,7 +735,7 @@
               <w:sz w:val="22"/>
             </w:rPr>
           </w:pPr>
-          <w:hyperlink w:anchor="_Toc236216656" w:history="1">
+          <w:hyperlink w:anchor="_Toc238036125" w:history="1">
             <w:r>
               <w:rPr>
                 <w:rStyle w:val="Hyperlink"/>
@@ -629,6 +750,47 @@
                 <w:webHidden/>
               </w:rPr>
               <w:tab/>
+            </w:r>
+            <w:r>
+              <w:rPr>
+                <w:noProof/>
+                <w:webHidden/>
+              </w:rPr>
+              <w:fldChar w:fldCharType="begin"/>
+            </w:r>
+            <w:r>
+              <w:rPr>
+                <w:noProof/>
+                <w:webHidden/>
+              </w:rPr>
+              <w:instrText xml:space="preserve"> PAGEREF _Toc238036125 \h </w:instrText>
+            </w:r>
+            <w:r>
+              <w:rPr>
+                <w:noProof/>
+                <w:webHidden/>
+              </w:rPr>
+            </w:r>
+            <w:r>
+              <w:rPr>
+                <w:noProof/>
+                <w:webHidden/>
+              </w:rPr>
+              <w:fldChar w:fldCharType="separate"/>
+            </w:r>
+            <w:r>
+              <w:rPr>
+                <w:noProof/>
+                <w:webHidden/>
+              </w:rPr>
+              <w:t>4</w:t>
+            </w:r>
+            <w:r>
+              <w:rPr>
+                <w:noProof/>
+                <w:webHidden/>
+              </w:rPr>
+              <w:fldChar w:fldCharType="end"/>
             </w:r>
           </w:hyperlink>
         </w:p>
@@ -641,7 +803,7 @@
               <w:sz w:val="22"/>
             </w:rPr>
           </w:pPr>
-          <w:hyperlink w:anchor="_Toc236216657" w:history="1">
+          <w:hyperlink w:anchor="_Toc238036126" w:history="1">
             <w:r>
               <w:rPr>
                 <w:rStyle w:val="Hyperlink"/>
@@ -656,6 +818,47 @@
                 <w:webHidden/>
               </w:rPr>
               <w:tab/>
+            </w:r>
+            <w:r>
+              <w:rPr>
+                <w:noProof/>
+                <w:webHidden/>
+              </w:rPr>
+              <w:fldChar w:fldCharType="begin"/>
+            </w:r>
+            <w:r>
+              <w:rPr>
+                <w:noProof/>
+                <w:webHidden/>
+              </w:rPr>
+              <w:instrText xml:space="preserve"> PAGEREF _Toc238036126 \h </w:instrText>
+            </w:r>
+            <w:r>
+              <w:rPr>
+                <w:noProof/>
+                <w:webHidden/>
+              </w:rPr>
+            </w:r>
+            <w:r>
+              <w:rPr>
+                <w:noProof/>
+                <w:webHidden/>
+              </w:rPr>
+              <w:fldChar w:fldCharType="separate"/>
+            </w:r>
+            <w:r>
+              <w:rPr>
+                <w:noProof/>
+                <w:webHidden/>
+              </w:rPr>
+              <w:t>4</w:t>
+            </w:r>
+            <w:r>
+              <w:rPr>
+                <w:noProof/>
+                <w:webHidden/>
+              </w:rPr>
+              <w:fldChar w:fldCharType="end"/>
             </w:r>
           </w:hyperlink>
         </w:p>
@@ -668,7 +871,7 @@
               <w:sz w:val="22"/>
             </w:rPr>
           </w:pPr>
-          <w:hyperlink w:anchor="_Toc236216658" w:history="1">
+          <w:hyperlink w:anchor="_Toc238036127" w:history="1">
             <w:r>
               <w:rPr>
                 <w:rStyle w:val="Hyperlink"/>
@@ -683,6 +886,47 @@
                 <w:webHidden/>
               </w:rPr>
               <w:tab/>
+            </w:r>
+            <w:r>
+              <w:rPr>
+                <w:noProof/>
+                <w:webHidden/>
+              </w:rPr>
+              <w:fldChar w:fldCharType="begin"/>
+            </w:r>
+            <w:r>
+              <w:rPr>
+                <w:noProof/>
+                <w:webHidden/>
+              </w:rPr>
+              <w:instrText xml:space="preserve"> PAGEREF _Toc238036127 \h </w:instrText>
+            </w:r>
+            <w:r>
+              <w:rPr>
+                <w:noProof/>
+                <w:webHidden/>
+              </w:rPr>
+            </w:r>
+            <w:r>
+              <w:rPr>
+                <w:noProof/>
+                <w:webHidden/>
+              </w:rPr>
+              <w:fldChar w:fldCharType="separate"/>
+            </w:r>
+            <w:r>
+              <w:rPr>
+                <w:noProof/>
+                <w:webHidden/>
+              </w:rPr>
+              <w:t>4</w:t>
+            </w:r>
+            <w:r>
+              <w:rPr>
+                <w:noProof/>
+                <w:webHidden/>
+              </w:rPr>
+              <w:fldChar w:fldCharType="end"/>
             </w:r>
           </w:hyperlink>
         </w:p>
@@ -695,7 +939,7 @@
               <w:sz w:val="22"/>
             </w:rPr>
           </w:pPr>
-          <w:hyperlink w:anchor="_Toc236216659" w:history="1">
+          <w:hyperlink w:anchor="_Toc238036128" w:history="1">
             <w:r>
               <w:rPr>
                 <w:rStyle w:val="Hyperlink"/>
@@ -710,6 +954,47 @@
                 <w:webHidden/>
               </w:rPr>
               <w:tab/>
+            </w:r>
+            <w:r>
+              <w:rPr>
+                <w:noProof/>
+                <w:webHidden/>
+              </w:rPr>
+              <w:fldChar w:fldCharType="begin"/>
+            </w:r>
+            <w:r>
+              <w:rPr>
+                <w:noProof/>
+                <w:webHidden/>
+              </w:rPr>
+              <w:instrText xml:space="preserve"> PAGEREF _Toc238036128 \h </w:instrText>
+            </w:r>
+            <w:r>
+              <w:rPr>
+                <w:noProof/>
+                <w:webHidden/>
+              </w:rPr>
+            </w:r>
+            <w:r>
+              <w:rPr>
+                <w:noProof/>
+                <w:webHidden/>
+              </w:rPr>
+              <w:fldChar w:fldCharType="separate"/>
+            </w:r>
+            <w:r>
+              <w:rPr>
+                <w:noProof/>
+                <w:webHidden/>
+              </w:rPr>
+              <w:t>5</w:t>
+            </w:r>
+            <w:r>
+              <w:rPr>
+                <w:noProof/>
+                <w:webHidden/>
+              </w:rPr>
+              <w:fldChar w:fldCharType="end"/>
             </w:r>
           </w:hyperlink>
         </w:p>
@@ -722,7 +1007,7 @@
               <w:sz w:val="22"/>
             </w:rPr>
           </w:pPr>
-          <w:hyperlink w:anchor="_Toc236216660" w:history="1">
+          <w:hyperlink w:anchor="_Toc238036129" w:history="1">
             <w:r>
               <w:rPr>
                 <w:rStyle w:val="Hyperlink"/>
@@ -737,6 +1022,47 @@
                 <w:webHidden/>
               </w:rPr>
               <w:tab/>
+            </w:r>
+            <w:r>
+              <w:rPr>
+                <w:noProof/>
+                <w:webHidden/>
+              </w:rPr>
+              <w:fldChar w:fldCharType="begin"/>
+            </w:r>
+            <w:r>
+              <w:rPr>
+                <w:noProof/>
+                <w:webHidden/>
+              </w:rPr>
+              <w:instrText xml:space="preserve"> PAGEREF _Toc238036129 \h </w:instrText>
+            </w:r>
+            <w:r>
+              <w:rPr>
+                <w:noProof/>
+                <w:webHidden/>
+              </w:rPr>
+            </w:r>
+            <w:r>
+              <w:rPr>
+                <w:noProof/>
+                <w:webHidden/>
+              </w:rPr>
+              <w:fldChar w:fldCharType="separate"/>
+            </w:r>
+            <w:r>
+              <w:rPr>
+                <w:noProof/>
+                <w:webHidden/>
+              </w:rPr>
+              <w:t>5</w:t>
+            </w:r>
+            <w:r>
+              <w:rPr>
+                <w:noProof/>
+                <w:webHidden/>
+              </w:rPr>
+              <w:fldChar w:fldCharType="end"/>
             </w:r>
           </w:hyperlink>
         </w:p>
@@ -749,7 +1075,7 @@
               <w:sz w:val="22"/>
             </w:rPr>
           </w:pPr>
-          <w:hyperlink w:anchor="_Toc236216661" w:history="1">
+          <w:hyperlink w:anchor="_Toc238036130" w:history="1">
             <w:r>
               <w:rPr>
                 <w:rStyle w:val="Hyperlink"/>
@@ -764,6 +1090,47 @@
                 <w:webHidden/>
               </w:rPr>
               <w:tab/>
+            </w:r>
+            <w:r>
+              <w:rPr>
+                <w:noProof/>
+                <w:webHidden/>
+              </w:rPr>
+              <w:fldChar w:fldCharType="begin"/>
+            </w:r>
+            <w:r>
+              <w:rPr>
+                <w:noProof/>
+                <w:webHidden/>
+              </w:rPr>
+              <w:instrText xml:space="preserve"> PAGEREF _Toc238036130 \h </w:instrText>
+            </w:r>
+            <w:r>
+              <w:rPr>
+                <w:noProof/>
+                <w:webHidden/>
+              </w:rPr>
+            </w:r>
+            <w:r>
+              <w:rPr>
+                <w:noProof/>
+                <w:webHidden/>
+              </w:rPr>
+              <w:fldChar w:fldCharType="separate"/>
+            </w:r>
+            <w:r>
+              <w:rPr>
+                <w:noProof/>
+                <w:webHidden/>
+              </w:rPr>
+              <w:t>5</w:t>
+            </w:r>
+            <w:r>
+              <w:rPr>
+                <w:noProof/>
+                <w:webHidden/>
+              </w:rPr>
+              <w:fldChar w:fldCharType="end"/>
             </w:r>
           </w:hyperlink>
         </w:p>
@@ -775,7 +1142,7 @@
               <w:noProof/>
             </w:rPr>
           </w:pPr>
-          <w:hyperlink w:anchor="_Toc236216662" w:history="1">
+          <w:hyperlink w:anchor="_Toc238036131" w:history="1">
             <w:r>
               <w:rPr>
                 <w:rStyle w:val="Hyperlink"/>
@@ -789,6 +1156,47 @@
                 <w:webHidden/>
               </w:rPr>
               <w:tab/>
+            </w:r>
+            <w:r>
+              <w:rPr>
+                <w:noProof/>
+                <w:webHidden/>
+              </w:rPr>
+              <w:fldChar w:fldCharType="begin"/>
+            </w:r>
+            <w:r>
+              <w:rPr>
+                <w:noProof/>
+                <w:webHidden/>
+              </w:rPr>
+              <w:instrText xml:space="preserve"> PAGEREF _Toc238036131 \h </w:instrText>
+            </w:r>
+            <w:r>
+              <w:rPr>
+                <w:noProof/>
+                <w:webHidden/>
+              </w:rPr>
+            </w:r>
+            <w:r>
+              <w:rPr>
+                <w:noProof/>
+                <w:webHidden/>
+              </w:rPr>
+              <w:fldChar w:fldCharType="separate"/>
+            </w:r>
+            <w:r>
+              <w:rPr>
+                <w:noProof/>
+                <w:webHidden/>
+              </w:rPr>
+              <w:t>6</w:t>
+            </w:r>
+            <w:r>
+              <w:rPr>
+                <w:noProof/>
+                <w:webHidden/>
+              </w:rPr>
+              <w:fldChar w:fldCharType="end"/>
             </w:r>
           </w:hyperlink>
         </w:p>
@@ -801,13 +1209,13 @@
               <w:sz w:val="22"/>
             </w:rPr>
           </w:pPr>
-          <w:hyperlink w:anchor="_Toc236216663" w:history="1">
+          <w:hyperlink w:anchor="_Toc238036132" w:history="1">
             <w:r>
               <w:rPr>
                 <w:rStyle w:val="Hyperlink"/>
                 <w:noProof/>
               </w:rPr>
-              <w:t>HTML</w:t>
+              <w:t>1.2 HTML</w:t>
             </w:r>
             <w:r>
               <w:rPr>
@@ -815,7 +1223,47 @@
                 <w:webHidden/>
               </w:rPr>
               <w:tab/>
-              <w:t>1.2</w:t>
+            </w:r>
+            <w:r>
+              <w:rPr>
+                <w:noProof/>
+                <w:webHidden/>
+              </w:rPr>
+              <w:fldChar w:fldCharType="begin"/>
+            </w:r>
+            <w:r>
+              <w:rPr>
+                <w:noProof/>
+                <w:webHidden/>
+              </w:rPr>
+              <w:instrText xml:space="preserve"> PAGEREF _Toc238036132 \h </w:instrText>
+            </w:r>
+            <w:r>
+              <w:rPr>
+                <w:noProof/>
+                <w:webHidden/>
+              </w:rPr>
+            </w:r>
+            <w:r>
+              <w:rPr>
+                <w:noProof/>
+                <w:webHidden/>
+              </w:rPr>
+              <w:fldChar w:fldCharType="separate"/>
+            </w:r>
+            <w:r>
+              <w:rPr>
+                <w:noProof/>
+                <w:webHidden/>
+              </w:rPr>
+              <w:t>6</w:t>
+            </w:r>
+            <w:r>
+              <w:rPr>
+                <w:noProof/>
+                <w:webHidden/>
+              </w:rPr>
+              <w:fldChar w:fldCharType="end"/>
             </w:r>
           </w:hyperlink>
         </w:p>
@@ -828,13 +1276,13 @@
               <w:sz w:val="22"/>
             </w:rPr>
           </w:pPr>
-          <w:hyperlink w:anchor="_Toc236216664" w:history="1">
+          <w:hyperlink w:anchor="_Toc238036133" w:history="1">
             <w:r>
               <w:rPr>
                 <w:rStyle w:val="Hyperlink"/>
                 <w:noProof/>
               </w:rPr>
-              <w:t>CSS</w:t>
+              <w:t>1.3 CSS</w:t>
             </w:r>
             <w:r>
               <w:rPr>
@@ -842,7 +1290,47 @@
                 <w:webHidden/>
               </w:rPr>
               <w:tab/>
-              <w:t>1.3</w:t>
+            </w:r>
+            <w:r>
+              <w:rPr>
+                <w:noProof/>
+                <w:webHidden/>
+              </w:rPr>
+              <w:fldChar w:fldCharType="begin"/>
+            </w:r>
+            <w:r>
+              <w:rPr>
+                <w:noProof/>
+                <w:webHidden/>
+              </w:rPr>
+              <w:instrText xml:space="preserve"> PAGEREF _Toc238036133 \h </w:instrText>
+            </w:r>
+            <w:r>
+              <w:rPr>
+                <w:noProof/>
+                <w:webHidden/>
+              </w:rPr>
+            </w:r>
+            <w:r>
+              <w:rPr>
+                <w:noProof/>
+                <w:webHidden/>
+              </w:rPr>
+              <w:fldChar w:fldCharType="separate"/>
+            </w:r>
+            <w:r>
+              <w:rPr>
+                <w:noProof/>
+                <w:webHidden/>
+              </w:rPr>
+              <w:t>6</w:t>
+            </w:r>
+            <w:r>
+              <w:rPr>
+                <w:noProof/>
+                <w:webHidden/>
+              </w:rPr>
+              <w:fldChar w:fldCharType="end"/>
             </w:r>
           </w:hyperlink>
         </w:p>
@@ -855,13 +1343,13 @@
               <w:sz w:val="22"/>
             </w:rPr>
           </w:pPr>
-          <w:hyperlink w:anchor="_Toc236216665" w:history="1">
+          <w:hyperlink w:anchor="_Toc238036134" w:history="1">
             <w:r>
               <w:rPr>
                 <w:rStyle w:val="Hyperlink"/>
                 <w:noProof/>
               </w:rPr>
-              <w:t>JavaScript</w:t>
+              <w:t>1.4 JavaScript</w:t>
             </w:r>
             <w:r>
               <w:rPr>
@@ -869,7 +1357,47 @@
                 <w:webHidden/>
               </w:rPr>
               <w:tab/>
-              <w:t>1.4</w:t>
+            </w:r>
+            <w:r>
+              <w:rPr>
+                <w:noProof/>
+                <w:webHidden/>
+              </w:rPr>
+              <w:fldChar w:fldCharType="begin"/>
+            </w:r>
+            <w:r>
+              <w:rPr>
+                <w:noProof/>
+                <w:webHidden/>
+              </w:rPr>
+              <w:instrText xml:space="preserve"> PAGEREF _Toc238036134 \h </w:instrText>
+            </w:r>
+            <w:r>
+              <w:rPr>
+                <w:noProof/>
+                <w:webHidden/>
+              </w:rPr>
+            </w:r>
+            <w:r>
+              <w:rPr>
+                <w:noProof/>
+                <w:webHidden/>
+              </w:rPr>
+              <w:fldChar w:fldCharType="separate"/>
+            </w:r>
+            <w:r>
+              <w:rPr>
+                <w:noProof/>
+                <w:webHidden/>
+              </w:rPr>
+              <w:t>7</w:t>
+            </w:r>
+            <w:r>
+              <w:rPr>
+                <w:noProof/>
+                <w:webHidden/>
+              </w:rPr>
+              <w:fldChar w:fldCharType="end"/>
             </w:r>
           </w:hyperlink>
         </w:p>
@@ -882,13 +1410,13 @@
               <w:sz w:val="22"/>
             </w:rPr>
           </w:pPr>
-          <w:hyperlink w:anchor="_Toc236216666" w:history="1">
+          <w:hyperlink w:anchor="_Toc238036135" w:history="1">
             <w:r>
               <w:rPr>
                 <w:rStyle w:val="Hyperlink"/>
                 <w:noProof/>
               </w:rPr>
-              <w:t>IndexedDB</w:t>
+              <w:t>1.5 IndexedDB</w:t>
             </w:r>
             <w:r>
               <w:rPr>
@@ -896,7 +1424,47 @@
                 <w:webHidden/>
               </w:rPr>
               <w:tab/>
-              <w:t>1.5</w:t>
+            </w:r>
+            <w:r>
+              <w:rPr>
+                <w:noProof/>
+                <w:webHidden/>
+              </w:rPr>
+              <w:fldChar w:fldCharType="begin"/>
+            </w:r>
+            <w:r>
+              <w:rPr>
+                <w:noProof/>
+                <w:webHidden/>
+              </w:rPr>
+              <w:instrText xml:space="preserve"> PAGEREF _Toc238036135 \h </w:instrText>
+            </w:r>
+            <w:r>
+              <w:rPr>
+                <w:noProof/>
+                <w:webHidden/>
+              </w:rPr>
+            </w:r>
+            <w:r>
+              <w:rPr>
+                <w:noProof/>
+                <w:webHidden/>
+              </w:rPr>
+              <w:fldChar w:fldCharType="separate"/>
+            </w:r>
+            <w:r>
+              <w:rPr>
+                <w:noProof/>
+                <w:webHidden/>
+              </w:rPr>
+              <w:t>7</w:t>
+            </w:r>
+            <w:r>
+              <w:rPr>
+                <w:noProof/>
+                <w:webHidden/>
+              </w:rPr>
+              <w:fldChar w:fldCharType="end"/>
             </w:r>
           </w:hyperlink>
         </w:p>
@@ -909,13 +1477,13 @@
               <w:sz w:val="22"/>
             </w:rPr>
           </w:pPr>
-          <w:hyperlink w:anchor="_Toc236216667" w:history="1">
+          <w:hyperlink w:anchor="_Toc238036136" w:history="1">
             <w:r>
               <w:rPr>
                 <w:rStyle w:val="Hyperlink"/>
                 <w:noProof/>
               </w:rPr>
-              <w:t>Jira:</w:t>
+              <w:t>1.6 Jira:</w:t>
             </w:r>
             <w:r>
               <w:rPr>
@@ -923,7 +1491,114 @@
                 <w:webHidden/>
               </w:rPr>
               <w:tab/>
-              <w:t>1.6</w:t>
+            </w:r>
+            <w:r>
+              <w:rPr>
+                <w:noProof/>
+                <w:webHidden/>
+              </w:rPr>
+              <w:fldChar w:fldCharType="begin"/>
+            </w:r>
+            <w:r>
+              <w:rPr>
+                <w:noProof/>
+                <w:webHidden/>
+              </w:rPr>
+              <w:instrText xml:space="preserve"> PAGEREF _Toc238036136 \h </w:instrText>
+            </w:r>
+            <w:r>
+              <w:rPr>
+                <w:noProof/>
+                <w:webHidden/>
+              </w:rPr>
+            </w:r>
+            <w:r>
+              <w:rPr>
+                <w:noProof/>
+                <w:webHidden/>
+              </w:rPr>
+              <w:fldChar w:fldCharType="separate"/>
+            </w:r>
+            <w:r>
+              <w:rPr>
+                <w:noProof/>
+                <w:webHidden/>
+              </w:rPr>
+              <w:t>7</w:t>
+            </w:r>
+            <w:r>
+              <w:rPr>
+                <w:noProof/>
+                <w:webHidden/>
+              </w:rPr>
+              <w:fldChar w:fldCharType="end"/>
+            </w:r>
+          </w:hyperlink>
+        </w:p>
+        <w:p>
+          <w:pPr>
+            <w:pStyle w:val="TOC3"/>
+            <w:rPr>
+              <w:rFonts w:asciiTheme="minorHAnsi" w:eastAsiaTheme="minorEastAsia" w:hAnsiTheme="minorHAnsi" w:cstheme="minorBidi"/>
+              <w:noProof/>
+              <w:sz w:val="22"/>
+            </w:rPr>
+          </w:pPr>
+          <w:hyperlink w:anchor="_Toc238036137" w:history="1">
+            <w:r>
+              <w:rPr>
+                <w:rStyle w:val="Hyperlink"/>
+                <w:noProof/>
+              </w:rPr>
+              <w:t>1.7 Git &amp; GitHub:</w:t>
+            </w:r>
+            <w:r>
+              <w:rPr>
+                <w:noProof/>
+                <w:webHidden/>
+              </w:rPr>
+              <w:tab/>
+            </w:r>
+            <w:r>
+              <w:rPr>
+                <w:noProof/>
+                <w:webHidden/>
+              </w:rPr>
+              <w:fldChar w:fldCharType="begin"/>
+            </w:r>
+            <w:r>
+              <w:rPr>
+                <w:noProof/>
+                <w:webHidden/>
+              </w:rPr>
+              <w:instrText xml:space="preserve"> PAGEREF _Toc238036137 \h </w:instrText>
+            </w:r>
+            <w:r>
+              <w:rPr>
+                <w:noProof/>
+                <w:webHidden/>
+              </w:rPr>
+            </w:r>
+            <w:r>
+              <w:rPr>
+                <w:noProof/>
+                <w:webHidden/>
+              </w:rPr>
+              <w:fldChar w:fldCharType="separate"/>
+            </w:r>
+            <w:r>
+              <w:rPr>
+                <w:noProof/>
+                <w:webHidden/>
+              </w:rPr>
+              <w:t>7</w:t>
+            </w:r>
+            <w:r>
+              <w:rPr>
+                <w:noProof/>
+                <w:webHidden/>
+              </w:rPr>
+              <w:fldChar w:fldCharType="end"/>
             </w:r>
           </w:hyperlink>
         </w:p>
@@ -936,13 +1611,13 @@
               <w:noProof/>
             </w:rPr>
           </w:pPr>
-          <w:hyperlink w:anchor="_Toc236216668" w:history="1">
+          <w:hyperlink w:anchor="_Toc238036138" w:history="1">
             <w:r>
               <w:rPr>
                 <w:rStyle w:val="Hyperlink"/>
                 <w:noProof/>
               </w:rPr>
-              <w:t>Appendices</w:t>
+              <w:t>Appendices:</w:t>
             </w:r>
             <w:r>
               <w:rPr>
@@ -950,7 +1625,47 @@
                 <w:webHidden/>
               </w:rPr>
               <w:tab/>
-              <w:t>2</w:t>
+            </w:r>
+            <w:r>
+              <w:rPr>
+                <w:noProof/>
+                <w:webHidden/>
+              </w:rPr>
+              <w:fldChar w:fldCharType="begin"/>
+            </w:r>
+            <w:r>
+              <w:rPr>
+                <w:noProof/>
+                <w:webHidden/>
+              </w:rPr>
+              <w:instrText xml:space="preserve"> PAGEREF _Toc238036138 \h </w:instrText>
+            </w:r>
+            <w:r>
+              <w:rPr>
+                <w:noProof/>
+                <w:webHidden/>
+              </w:rPr>
+            </w:r>
+            <w:r>
+              <w:rPr>
+                <w:noProof/>
+                <w:webHidden/>
+              </w:rPr>
+              <w:fldChar w:fldCharType="separate"/>
+            </w:r>
+            <w:r>
+              <w:rPr>
+                <w:noProof/>
+                <w:webHidden/>
+              </w:rPr>
+              <w:t>8</w:t>
+            </w:r>
+            <w:r>
+              <w:rPr>
+                <w:noProof/>
+                <w:webHidden/>
+              </w:rPr>
+              <w:fldChar w:fldCharType="end"/>
             </w:r>
           </w:hyperlink>
         </w:p>
@@ -962,7 +1677,7 @@
               <w:noProof/>
             </w:rPr>
           </w:pPr>
-          <w:hyperlink w:anchor="_Toc236216669" w:history="1">
+          <w:hyperlink w:anchor="_Toc238036139" w:history="1">
             <w:r>
               <w:rPr>
                 <w:rStyle w:val="Hyperlink"/>
@@ -976,6 +1691,47 @@
                 <w:webHidden/>
               </w:rPr>
               <w:tab/>
+            </w:r>
+            <w:r>
+              <w:rPr>
+                <w:noProof/>
+                <w:webHidden/>
+              </w:rPr>
+              <w:fldChar w:fldCharType="begin"/>
+            </w:r>
+            <w:r>
+              <w:rPr>
+                <w:noProof/>
+                <w:webHidden/>
+              </w:rPr>
+              <w:instrText xml:space="preserve"> PAGEREF _Toc238036139 \h </w:instrText>
+            </w:r>
+            <w:r>
+              <w:rPr>
+                <w:noProof/>
+                <w:webHidden/>
+              </w:rPr>
+            </w:r>
+            <w:r>
+              <w:rPr>
+                <w:noProof/>
+                <w:webHidden/>
+              </w:rPr>
+              <w:fldChar w:fldCharType="separate"/>
+            </w:r>
+            <w:r>
+              <w:rPr>
+                <w:noProof/>
+                <w:webHidden/>
+              </w:rPr>
+              <w:t>8</w:t>
+            </w:r>
+            <w:r>
+              <w:rPr>
+                <w:noProof/>
+                <w:webHidden/>
+              </w:rPr>
+              <w:fldChar w:fldCharType="end"/>
             </w:r>
           </w:hyperlink>
         </w:p>
@@ -987,7 +1743,7 @@
               <w:noProof/>
             </w:rPr>
           </w:pPr>
-          <w:hyperlink w:anchor="_Toc236216670" w:history="1">
+          <w:hyperlink w:anchor="_Toc238036140" w:history="1">
             <w:r>
               <w:rPr>
                 <w:rStyle w:val="Hyperlink"/>
@@ -1001,6 +1757,115 @@
                 <w:webHidden/>
               </w:rPr>
               <w:tab/>
+            </w:r>
+            <w:r>
+              <w:rPr>
+                <w:noProof/>
+                <w:webHidden/>
+              </w:rPr>
+              <w:fldChar w:fldCharType="begin"/>
+            </w:r>
+            <w:r>
+              <w:rPr>
+                <w:noProof/>
+                <w:webHidden/>
+              </w:rPr>
+              <w:instrText xml:space="preserve"> PAGEREF _Toc238036140 \h </w:instrText>
+            </w:r>
+            <w:r>
+              <w:rPr>
+                <w:noProof/>
+                <w:webHidden/>
+              </w:rPr>
+            </w:r>
+            <w:r>
+              <w:rPr>
+                <w:noProof/>
+                <w:webHidden/>
+              </w:rPr>
+              <w:fldChar w:fldCharType="separate"/>
+            </w:r>
+            <w:r>
+              <w:rPr>
+                <w:noProof/>
+                <w:webHidden/>
+              </w:rPr>
+              <w:t>8</w:t>
+            </w:r>
+            <w:r>
+              <w:rPr>
+                <w:noProof/>
+                <w:webHidden/>
+              </w:rPr>
+              <w:fldChar w:fldCharType="end"/>
+            </w:r>
+          </w:hyperlink>
+          <w:bookmarkStart w:id="0" w:name="_GoBack"/>
+          <w:bookmarkEnd w:id="0"/>
+        </w:p>
+        <w:p>
+          <w:pPr>
+            <w:pStyle w:val="TOC2"/>
+            <w:rPr>
+              <w:rFonts w:asciiTheme="minorHAnsi" w:eastAsiaTheme="minorEastAsia" w:hAnsiTheme="minorHAnsi" w:cstheme="minorBidi"/>
+              <w:noProof/>
+            </w:rPr>
+          </w:pPr>
+          <w:hyperlink w:anchor="_Toc238036141" w:history="1">
+            <w:r>
+              <w:rPr>
+                <w:rStyle w:val="Hyperlink"/>
+                <w:noProof/>
+              </w:rPr>
+              <w:t>Fig 3:</w:t>
+            </w:r>
+            <w:r>
+              <w:rPr>
+                <w:noProof/>
+                <w:webHidden/>
+              </w:rPr>
+              <w:tab/>
+            </w:r>
+            <w:r>
+              <w:rPr>
+                <w:noProof/>
+                <w:webHidden/>
+              </w:rPr>
+              <w:fldChar w:fldCharType="begin"/>
+            </w:r>
+            <w:r>
+              <w:rPr>
+                <w:noProof/>
+                <w:webHidden/>
+              </w:rPr>
+              <w:instrText xml:space="preserve"> PAGEREF _Toc238036141 \h </w:instrText>
+            </w:r>
+            <w:r>
+              <w:rPr>
+                <w:noProof/>
+                <w:webHidden/>
+              </w:rPr>
+            </w:r>
+            <w:r>
+              <w:rPr>
+                <w:noProof/>
+                <w:webHidden/>
+              </w:rPr>
+              <w:fldChar w:fldCharType="separate"/>
+            </w:r>
+            <w:r>
+              <w:rPr>
+                <w:noProof/>
+                <w:webHidden/>
+              </w:rPr>
+              <w:t>9</w:t>
+            </w:r>
+            <w:r>
+              <w:rPr>
+                <w:noProof/>
+                <w:webHidden/>
+              </w:rPr>
+              <w:fldChar w:fldCharType="end"/>
             </w:r>
           </w:hyperlink>
         </w:p>
@@ -1012,13 +1877,13 @@
               <w:noProof/>
             </w:rPr>
           </w:pPr>
-          <w:hyperlink w:anchor="_Toc236216671" w:history="1">
+          <w:hyperlink w:anchor="_Toc238036142" w:history="1">
             <w:r>
               <w:rPr>
                 <w:rStyle w:val="Hyperlink"/>
                 <w:noProof/>
               </w:rPr>
-              <w:t>Fig 3:</w:t>
+              <w:t>Fig 4:</w:t>
             </w:r>
             <w:r>
               <w:rPr>
@@ -1026,6 +1891,47 @@
                 <w:webHidden/>
               </w:rPr>
               <w:tab/>
+            </w:r>
+            <w:r>
+              <w:rPr>
+                <w:noProof/>
+                <w:webHidden/>
+              </w:rPr>
+              <w:fldChar w:fldCharType="begin"/>
+            </w:r>
+            <w:r>
+              <w:rPr>
+                <w:noProof/>
+                <w:webHidden/>
+              </w:rPr>
+              <w:instrText xml:space="preserve"> PAGEREF _Toc238036142 \h </w:instrText>
+            </w:r>
+            <w:r>
+              <w:rPr>
+                <w:noProof/>
+                <w:webHidden/>
+              </w:rPr>
+            </w:r>
+            <w:r>
+              <w:rPr>
+                <w:noProof/>
+                <w:webHidden/>
+              </w:rPr>
+              <w:fldChar w:fldCharType="separate"/>
+            </w:r>
+            <w:r>
+              <w:rPr>
+                <w:noProof/>
+                <w:webHidden/>
+              </w:rPr>
+              <w:t>9</w:t>
+            </w:r>
+            <w:r>
+              <w:rPr>
+                <w:noProof/>
+                <w:webHidden/>
+              </w:rPr>
+              <w:fldChar w:fldCharType="end"/>
             </w:r>
           </w:hyperlink>
         </w:p>
@@ -1037,13 +1943,13 @@
               <w:noProof/>
             </w:rPr>
           </w:pPr>
-          <w:hyperlink w:anchor="_Toc236216672" w:history="1">
+          <w:hyperlink w:anchor="_Toc238036143" w:history="1">
             <w:r>
               <w:rPr>
                 <w:rStyle w:val="Hyperlink"/>
                 <w:noProof/>
               </w:rPr>
-              <w:t>Fig 4:</w:t>
+              <w:t>Fig 5:</w:t>
             </w:r>
             <w:r>
               <w:rPr>
@@ -1051,6 +1957,47 @@
                 <w:webHidden/>
               </w:rPr>
               <w:tab/>
+            </w:r>
+            <w:r>
+              <w:rPr>
+                <w:noProof/>
+                <w:webHidden/>
+              </w:rPr>
+              <w:fldChar w:fldCharType="begin"/>
+            </w:r>
+            <w:r>
+              <w:rPr>
+                <w:noProof/>
+                <w:webHidden/>
+              </w:rPr>
+              <w:instrText xml:space="preserve"> PAGEREF _Toc238036143 \h </w:instrText>
+            </w:r>
+            <w:r>
+              <w:rPr>
+                <w:noProof/>
+                <w:webHidden/>
+              </w:rPr>
+            </w:r>
+            <w:r>
+              <w:rPr>
+                <w:noProof/>
+                <w:webHidden/>
+              </w:rPr>
+              <w:fldChar w:fldCharType="separate"/>
+            </w:r>
+            <w:r>
+              <w:rPr>
+                <w:noProof/>
+                <w:webHidden/>
+              </w:rPr>
+              <w:t>10</w:t>
+            </w:r>
+            <w:r>
+              <w:rPr>
+                <w:noProof/>
+                <w:webHidden/>
+              </w:rPr>
+              <w:fldChar w:fldCharType="end"/>
             </w:r>
           </w:hyperlink>
         </w:p>
@@ -1062,13 +2009,13 @@
               <w:noProof/>
             </w:rPr>
           </w:pPr>
-          <w:hyperlink w:anchor="_Toc236216673" w:history="1">
+          <w:hyperlink w:anchor="_Toc238036144" w:history="1">
             <w:r>
               <w:rPr>
                 <w:rStyle w:val="Hyperlink"/>
                 <w:noProof/>
               </w:rPr>
-              <w:t>Fig 5:</w:t>
+              <w:t>Fig 6:</w:t>
             </w:r>
             <w:r>
               <w:rPr>
@@ -1076,6 +2023,47 @@
                 <w:webHidden/>
               </w:rPr>
               <w:tab/>
+            </w:r>
+            <w:r>
+              <w:rPr>
+                <w:noProof/>
+                <w:webHidden/>
+              </w:rPr>
+              <w:fldChar w:fldCharType="begin"/>
+            </w:r>
+            <w:r>
+              <w:rPr>
+                <w:noProof/>
+                <w:webHidden/>
+              </w:rPr>
+              <w:instrText xml:space="preserve"> PAGEREF _Toc238036144 \h </w:instrText>
+            </w:r>
+            <w:r>
+              <w:rPr>
+                <w:noProof/>
+                <w:webHidden/>
+              </w:rPr>
+            </w:r>
+            <w:r>
+              <w:rPr>
+                <w:noProof/>
+                <w:webHidden/>
+              </w:rPr>
+              <w:fldChar w:fldCharType="separate"/>
+            </w:r>
+            <w:r>
+              <w:rPr>
+                <w:noProof/>
+                <w:webHidden/>
+              </w:rPr>
+              <w:t>10</w:t>
+            </w:r>
+            <w:r>
+              <w:rPr>
+                <w:noProof/>
+                <w:webHidden/>
+              </w:rPr>
+              <w:fldChar w:fldCharType="end"/>
             </w:r>
           </w:hyperlink>
         </w:p>
@@ -1087,13 +2075,13 @@
               <w:noProof/>
             </w:rPr>
           </w:pPr>
-          <w:hyperlink w:anchor="_Toc236216674" w:history="1">
+          <w:hyperlink w:anchor="_Toc238036145" w:history="1">
             <w:r>
               <w:rPr>
                 <w:rStyle w:val="Hyperlink"/>
                 <w:noProof/>
               </w:rPr>
-              <w:t>Fig 6:</w:t>
+              <w:t>Fig 7:</w:t>
             </w:r>
             <w:r>
               <w:rPr>
@@ -1102,30 +2090,46 @@
               </w:rPr>
               <w:tab/>
             </w:r>
-          </w:hyperlink>
-        </w:p>
-        <w:p>
-          <w:pPr>
-            <w:pStyle w:val="TOC2"/>
-            <w:rPr>
-              <w:rFonts w:asciiTheme="minorHAnsi" w:eastAsiaTheme="minorEastAsia" w:hAnsiTheme="minorHAnsi" w:cstheme="minorBidi"/>
-              <w:noProof/>
-            </w:rPr>
-          </w:pPr>
-          <w:hyperlink w:anchor="_Toc236216675" w:history="1">
-            <w:r>
-              <w:rPr>
-                <w:rStyle w:val="Hyperlink"/>
-                <w:noProof/>
-              </w:rPr>
-              <w:t>Fig 7:</w:t>
-            </w:r>
-            <w:r>
-              <w:rPr>
-                <w:noProof/>
-                <w:webHidden/>
-              </w:rPr>
-              <w:tab/>
+            <w:r>
+              <w:rPr>
+                <w:noProof/>
+                <w:webHidden/>
+              </w:rPr>
+              <w:fldChar w:fldCharType="begin"/>
+            </w:r>
+            <w:r>
+              <w:rPr>
+                <w:noProof/>
+                <w:webHidden/>
+              </w:rPr>
+              <w:instrText xml:space="preserve"> PAGEREF _Toc238036145 \h </w:instrText>
+            </w:r>
+            <w:r>
+              <w:rPr>
+                <w:noProof/>
+                <w:webHidden/>
+              </w:rPr>
+            </w:r>
+            <w:r>
+              <w:rPr>
+                <w:noProof/>
+                <w:webHidden/>
+              </w:rPr>
+              <w:fldChar w:fldCharType="separate"/>
+            </w:r>
+            <w:r>
+              <w:rPr>
+                <w:noProof/>
+                <w:webHidden/>
+              </w:rPr>
+              <w:t>11</w:t>
+            </w:r>
+            <w:r>
+              <w:rPr>
+                <w:noProof/>
+                <w:webHidden/>
+              </w:rPr>
+              <w:fldChar w:fldCharType="end"/>
             </w:r>
           </w:hyperlink>
         </w:p>
@@ -1138,7 +2142,7 @@
               <w:noProof/>
             </w:rPr>
           </w:pPr>
-          <w:hyperlink w:anchor="_Toc236216676" w:history="1">
+          <w:hyperlink w:anchor="_Toc238036146" w:history="1">
             <w:r>
               <w:rPr>
                 <w:rStyle w:val="Hyperlink"/>
@@ -1152,6 +2156,47 @@
                 <w:webHidden/>
               </w:rPr>
               <w:tab/>
+            </w:r>
+            <w:r>
+              <w:rPr>
+                <w:noProof/>
+                <w:webHidden/>
+              </w:rPr>
+              <w:fldChar w:fldCharType="begin"/>
+            </w:r>
+            <w:r>
+              <w:rPr>
+                <w:noProof/>
+                <w:webHidden/>
+              </w:rPr>
+              <w:instrText xml:space="preserve"> PAGEREF _Toc238036146 \h </w:instrText>
+            </w:r>
+            <w:r>
+              <w:rPr>
+                <w:noProof/>
+                <w:webHidden/>
+              </w:rPr>
+            </w:r>
+            <w:r>
+              <w:rPr>
+                <w:noProof/>
+                <w:webHidden/>
+              </w:rPr>
+              <w:fldChar w:fldCharType="separate"/>
+            </w:r>
+            <w:r>
+              <w:rPr>
+                <w:noProof/>
+                <w:webHidden/>
+              </w:rPr>
+              <w:t>11</w:t>
+            </w:r>
+            <w:r>
+              <w:rPr>
+                <w:noProof/>
+                <w:webHidden/>
+              </w:rPr>
+              <w:fldChar w:fldCharType="end"/>
             </w:r>
           </w:hyperlink>
         </w:p>
@@ -1188,7 +2233,7 @@
           <w:rFonts w:ascii="Times New Roman" w:hAnsi="Times New Roman" w:cs="Times New Roman"/>
         </w:rPr>
       </w:pPr>
-      <w:bookmarkStart w:id="0" w:name="_Toc236216653"/>
+      <w:bookmarkStart w:id="1" w:name="_Toc238036122"/>
       <w:r>
         <w:rPr>
           <w:rFonts w:ascii="Times New Roman" w:hAnsi="Times New Roman" w:cs="Times New Roman"/>
@@ -1196,7 +2241,7 @@
         <w:lastRenderedPageBreak/>
         <w:t>Introduction</w:t>
       </w:r>
-      <w:bookmarkEnd w:id="0"/>
+      <w:bookmarkEnd w:id="1"/>
     </w:p>
     <w:p>
       <w:pPr>
@@ -1251,7 +2296,6 @@
         </w:rPr>
         <w:t xml:space="preserve">To address these challenges, </w:t>
       </w:r>
-      <w:proofErr w:type="spellStart"/>
       <w:r>
         <w:rPr>
           <w:rFonts w:ascii="Times New Roman" w:eastAsia="Times New Roman" w:hAnsi="Times New Roman" w:cs="Times New Roman"/>
@@ -1262,32 +2306,13 @@
         </w:rPr>
         <w:t>InternFlow</w:t>
       </w:r>
-      <w:proofErr w:type="spellEnd"/>
       <w:r>
         <w:rPr>
           <w:rFonts w:ascii="Times New Roman" w:eastAsia="Times New Roman" w:hAnsi="Times New Roman" w:cs="Times New Roman"/>
           <w:sz w:val="24"/>
           <w:szCs w:val="24"/>
         </w:rPr>
-        <w:t xml:space="preserve"> is proposed as a digital internship management system. The system automates intern registration, attendance tracking, supervisor assignment, and performance reporting through a centralized platform. By replacing manual processes with a digital solution, </w:t>
-      </w:r>
-      <w:proofErr w:type="spellStart"/>
-      <w:r>
-        <w:rPr>
-          <w:rFonts w:ascii="Times New Roman" w:eastAsia="Times New Roman" w:hAnsi="Times New Roman" w:cs="Times New Roman"/>
-          <w:sz w:val="24"/>
-          <w:szCs w:val="24"/>
-        </w:rPr>
-        <w:t>InternFlow</w:t>
-      </w:r>
-      <w:proofErr w:type="spellEnd"/>
-      <w:r>
-        <w:rPr>
-          <w:rFonts w:ascii="Times New Roman" w:eastAsia="Times New Roman" w:hAnsi="Times New Roman" w:cs="Times New Roman"/>
-          <w:sz w:val="24"/>
-          <w:szCs w:val="24"/>
-        </w:rPr>
-        <w:t xml:space="preserve"> improves efficiency, enhances record accuracy, simplifies monitoring, and provides better support for managing internship activities at PRESPRINT PLC.</w:t>
+        <w:t xml:space="preserve"> is proposed as a digital internship management system. The system automates intern registration, attendance tracking, supervisor assignment, and performance reporting through a centralized platform. By replacing manual processes with a digital solution, InternFlow improves efficiency, enhances record accuracy, simplifies monitoring, and provides better support for managing internship activities at PRESPRINT PLC.</w:t>
       </w:r>
     </w:p>
     <w:p>
@@ -1310,14 +2335,14 @@
           <w:rFonts w:ascii="Times New Roman" w:hAnsi="Times New Roman" w:cs="Times New Roman"/>
         </w:rPr>
       </w:pPr>
-      <w:bookmarkStart w:id="1" w:name="_Toc236216654"/>
+      <w:bookmarkStart w:id="2" w:name="_Toc238036123"/>
       <w:r>
         <w:rPr>
           <w:rFonts w:ascii="Times New Roman" w:hAnsi="Times New Roman" w:cs="Times New Roman"/>
         </w:rPr>
         <w:t>Tools</w:t>
       </w:r>
-      <w:bookmarkEnd w:id="1"/>
+      <w:bookmarkEnd w:id="2"/>
     </w:p>
     <w:p>
       <w:pPr>
@@ -1403,7 +2428,7 @@
           <w:sz w:val="24"/>
         </w:rPr>
       </w:pPr>
-      <w:bookmarkStart w:id="2" w:name="_Toc236216655"/>
+      <w:bookmarkStart w:id="3" w:name="_Toc238036124"/>
       <w:r>
         <w:rPr>
           <w:rFonts w:ascii="Times New Roman" w:hAnsi="Times New Roman" w:cs="Times New Roman"/>
@@ -1418,7 +2443,7 @@
         </w:rPr>
         <w:t>UML</w:t>
       </w:r>
-      <w:bookmarkEnd w:id="2"/>
+      <w:bookmarkEnd w:id="3"/>
     </w:p>
     <w:p>
       <w:pPr>
@@ -1670,7 +2695,7 @@
           <w:sz w:val="22"/>
         </w:rPr>
       </w:pPr>
-      <w:bookmarkStart w:id="3" w:name="_Toc236216656"/>
+      <w:bookmarkStart w:id="4" w:name="_Toc238036125"/>
       <w:r>
         <w:rPr>
           <w:rStyle w:val="Heading3Char"/>
@@ -1679,7 +2704,7 @@
         <w:lastRenderedPageBreak/>
         <w:t>FIG 1</w:t>
       </w:r>
-      <w:bookmarkEnd w:id="3"/>
+      <w:bookmarkEnd w:id="4"/>
       <w:r>
         <w:rPr>
           <w:b/>
@@ -1778,7 +2803,7 @@
           <w:sz w:val="22"/>
         </w:rPr>
       </w:pPr>
-      <w:bookmarkStart w:id="4" w:name="_Toc236216657"/>
+      <w:bookmarkStart w:id="5" w:name="_Toc238036126"/>
       <w:r>
         <w:rPr>
           <w:rStyle w:val="Heading3Char"/>
@@ -1786,7 +2811,7 @@
         </w:rPr>
         <w:t>FIG 2</w:t>
       </w:r>
-      <w:bookmarkEnd w:id="4"/>
+      <w:bookmarkEnd w:id="5"/>
       <w:r>
         <w:rPr>
           <w:b/>
@@ -1885,7 +2910,7 @@
           <w:sz w:val="22"/>
         </w:rPr>
       </w:pPr>
-      <w:bookmarkStart w:id="5" w:name="_Toc236216658"/>
+      <w:bookmarkStart w:id="6" w:name="_Toc238036127"/>
       <w:r>
         <w:rPr>
           <w:rStyle w:val="Heading3Char"/>
@@ -1893,7 +2918,7 @@
         </w:rPr>
         <w:t>FIG 3</w:t>
       </w:r>
-      <w:bookmarkEnd w:id="5"/>
+      <w:bookmarkEnd w:id="6"/>
       <w:r>
         <w:rPr>
           <w:b/>
@@ -2004,7 +3029,7 @@
           <w:sz w:val="22"/>
         </w:rPr>
       </w:pPr>
-      <w:bookmarkStart w:id="6" w:name="_Toc236216659"/>
+      <w:bookmarkStart w:id="7" w:name="_Toc238036128"/>
       <w:r>
         <w:rPr>
           <w:rStyle w:val="Heading3Char"/>
@@ -2012,7 +3037,7 @@
         </w:rPr>
         <w:t>FIG 4</w:t>
       </w:r>
-      <w:bookmarkEnd w:id="6"/>
+      <w:bookmarkEnd w:id="7"/>
       <w:r>
         <w:rPr>
           <w:b/>
@@ -2112,7 +3137,7 @@
           <w:sz w:val="22"/>
         </w:rPr>
       </w:pPr>
-      <w:bookmarkStart w:id="7" w:name="_Toc236216660"/>
+      <w:bookmarkStart w:id="8" w:name="_Toc238036129"/>
       <w:r>
         <w:rPr>
           <w:rStyle w:val="Heading3Char"/>
@@ -2120,7 +3145,7 @@
         </w:rPr>
         <w:t>FIG 5</w:t>
       </w:r>
-      <w:bookmarkEnd w:id="7"/>
+      <w:bookmarkEnd w:id="8"/>
       <w:r>
         <w:rPr>
           <w:b/>
@@ -2199,7 +3224,7 @@
           <w:szCs w:val="24"/>
         </w:rPr>
       </w:pPr>
-      <w:bookmarkStart w:id="8" w:name="_Toc236216661"/>
+      <w:bookmarkStart w:id="9" w:name="_Toc238036130"/>
       <w:r>
         <w:rPr>
           <w:rStyle w:val="Heading3Char"/>
@@ -2208,7 +3233,7 @@
         </w:rPr>
         <w:t>Class Diagram:</w:t>
       </w:r>
-      <w:bookmarkEnd w:id="8"/>
+      <w:bookmarkEnd w:id="9"/>
       <w:r>
         <w:rPr>
           <w:rFonts w:eastAsia="Times New Roman"/>
@@ -2227,24 +3252,218 @@
       </w:r>
     </w:p>
     <w:p>
-      <w:pPr>
-        <w:spacing w:line="360" w:lineRule="auto"/>
-        <w:rPr>
-          <w:b/>
-          <w:sz w:val="24"/>
-          <w:szCs w:val="24"/>
-        </w:rPr>
-      </w:pPr>
-      <w:r>
-        <w:rPr>
-          <w:b/>
+      <w:r>
+        <w:rPr>
           <w:noProof/>
-          <w:sz w:val="24"/>
-          <w:szCs w:val="24"/>
         </w:rPr>
         <w:lastRenderedPageBreak/>
+        <mc:AlternateContent>
+          <mc:Choice Requires="wps">
+            <w:drawing>
+              <wp:anchor distT="0" distB="0" distL="114300" distR="114300" simplePos="0" relativeHeight="251664384" behindDoc="0" locked="0" layoutInCell="1" allowOverlap="1" wp14:anchorId="22B16FFC" wp14:editId="6C5652A9">
+                <wp:simplePos x="0" y="0"/>
+                <wp:positionH relativeFrom="column">
+                  <wp:posOffset>1657350</wp:posOffset>
+                </wp:positionH>
+                <wp:positionV relativeFrom="paragraph">
+                  <wp:posOffset>3105150</wp:posOffset>
+                </wp:positionV>
+                <wp:extent cx="247650" cy="247650"/>
+                <wp:effectExtent l="0" t="0" r="0" b="0"/>
+                <wp:wrapNone/>
+                <wp:docPr id="8" name="Text Box 8"/>
+                <wp:cNvGraphicFramePr/>
+                <a:graphic xmlns:a="http://schemas.openxmlformats.org/drawingml/2006/main">
+                  <a:graphicData uri="http://schemas.microsoft.com/office/word/2010/wordprocessingShape">
+                    <wps:wsp>
+                      <wps:cNvSpPr txBox="1"/>
+                      <wps:spPr>
+                        <a:xfrm>
+                          <a:off x="0" y="0"/>
+                          <a:ext cx="247650" cy="247650"/>
+                        </a:xfrm>
+                        <a:prstGeom prst="rect">
+                          <a:avLst/>
+                        </a:prstGeom>
+                        <a:solidFill>
+                          <a:schemeClr val="lt1"/>
+                        </a:solidFill>
+                        <a:ln w="6350">
+                          <a:noFill/>
+                        </a:ln>
+                        <a:effectLst/>
+                      </wps:spPr>
+                      <wps:style>
+                        <a:lnRef idx="0">
+                          <a:schemeClr val="accent1"/>
+                        </a:lnRef>
+                        <a:fillRef idx="0">
+                          <a:schemeClr val="accent1"/>
+                        </a:fillRef>
+                        <a:effectRef idx="0">
+                          <a:schemeClr val="accent1"/>
+                        </a:effectRef>
+                        <a:fontRef idx="minor">
+                          <a:schemeClr val="dk1"/>
+                        </a:fontRef>
+                      </wps:style>
+                      <wps:txbx>
+                        <w:txbxContent>
+                          <w:p>
+                            <w:proofErr w:type="gramStart"/>
+                            <w:r>
+                              <w:t>n</w:t>
+                            </w:r>
+                            <w:proofErr w:type="gramEnd"/>
+                          </w:p>
+                        </w:txbxContent>
+                      </wps:txbx>
+                      <wps:bodyPr rot="0" spcFirstLastPara="0" vertOverflow="overflow" horzOverflow="overflow" vert="horz" wrap="square" lIns="91440" tIns="45720" rIns="91440" bIns="45720" numCol="1" spcCol="0" rtlCol="0" fromWordArt="0" anchor="t" anchorCtr="0" forceAA="0" compatLnSpc="1">
+                        <a:prstTxWarp prst="textNoShape">
+                          <a:avLst/>
+                        </a:prstTxWarp>
+                        <a:noAutofit/>
+                      </wps:bodyPr>
+                    </wps:wsp>
+                  </a:graphicData>
+                </a:graphic>
+                <wp14:sizeRelV relativeFrom="margin">
+                  <wp14:pctHeight>0</wp14:pctHeight>
+                </wp14:sizeRelV>
+              </wp:anchor>
+            </w:drawing>
+          </mc:Choice>
+          <mc:Fallback>
+            <w:pict>
+              <v:shape id="Text Box 8" o:spid="_x0000_s1028" type="#_x0000_t202" style="position:absolute;margin-left:130.5pt;margin-top:244.5pt;width:19.5pt;height:19.5pt;z-index:251664384;visibility:visible;mso-wrap-style:square;mso-height-percent:0;mso-wrap-distance-left:9pt;mso-wrap-distance-top:0;mso-wrap-distance-right:9pt;mso-wrap-distance-bottom:0;mso-position-horizontal:absolute;mso-position-horizontal-relative:text;mso-position-vertical:absolute;mso-position-vertical-relative:text;mso-height-percent:0;mso-height-relative:margin;v-text-anchor:top" o:gfxdata="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" fillcolor="white [3201]" stroked="f" strokeweight=".5pt">
+                <v:textbox>
+                  <w:txbxContent>
+                    <w:p>
+                      <w:proofErr w:type="gramStart"/>
+                      <w:r>
+                        <w:t>n</w:t>
+                      </w:r>
+                      <w:proofErr w:type="gramEnd"/>
+                    </w:p>
+                  </w:txbxContent>
+                </v:textbox>
+              </v:shape>
+            </w:pict>
+          </mc:Fallback>
+        </mc:AlternateContent>
+      </w:r>
+      <w:r>
+        <w:rPr>
+          <w:noProof/>
+        </w:rPr>
+        <mc:AlternateContent>
+          <mc:Choice Requires="wps">
+            <w:drawing>
+              <wp:anchor distT="0" distB="0" distL="114300" distR="114300" simplePos="0" relativeHeight="251663360" behindDoc="0" locked="0" layoutInCell="1" allowOverlap="1" wp14:anchorId="6F6F82DF" wp14:editId="45F284B0">
+                <wp:simplePos x="0" y="0"/>
+                <wp:positionH relativeFrom="column">
+                  <wp:posOffset>1657350</wp:posOffset>
+                </wp:positionH>
+                <wp:positionV relativeFrom="paragraph">
+                  <wp:posOffset>2943225</wp:posOffset>
+                </wp:positionV>
+                <wp:extent cx="247650" cy="228600"/>
+                <wp:effectExtent l="0" t="0" r="19050" b="19050"/>
+                <wp:wrapNone/>
+                <wp:docPr id="4" name="Text Box 4"/>
+                <wp:cNvGraphicFramePr/>
+                <a:graphic xmlns:a="http://schemas.openxmlformats.org/drawingml/2006/main">
+                  <a:graphicData uri="http://schemas.microsoft.com/office/word/2010/wordprocessingShape">
+                    <wps:wsp>
+                      <wps:cNvSpPr txBox="1"/>
+                      <wps:spPr>
+                        <a:xfrm>
+                          <a:off x="0" y="0"/>
+                          <a:ext cx="247650" cy="228600"/>
+                        </a:xfrm>
+                        <a:prstGeom prst="rect">
+                          <a:avLst/>
+                        </a:prstGeom>
+                        <a:solidFill>
+                          <a:schemeClr val="lt1"/>
+                        </a:solidFill>
+                        <a:ln w="6350">
+                          <a:solidFill>
+                            <a:schemeClr val="bg1"/>
+                          </a:solidFill>
+                        </a:ln>
+                        <a:effectLst/>
+                      </wps:spPr>
+                      <wps:style>
+                        <a:lnRef idx="0">
+                          <a:schemeClr val="accent1"/>
+                        </a:lnRef>
+                        <a:fillRef idx="0">
+                          <a:schemeClr val="accent1"/>
+                        </a:fillRef>
+                        <a:effectRef idx="0">
+                          <a:schemeClr val="accent1"/>
+                        </a:effectRef>
+                        <a:fontRef idx="minor">
+                          <a:schemeClr val="dk1"/>
+                        </a:fontRef>
+                      </wps:style>
+                      <wps:txbx>
+                        <w:txbxContent>
+                          <w:p>
+                            <w:pPr>
+                              <w:jc w:val="center"/>
+                            </w:pPr>
+                            <w:r>
+                              <w:t>1</w:t>
+                            </w:r>
+                          </w:p>
+                        </w:txbxContent>
+                      </wps:txbx>
+                      <wps:bodyPr rot="0" spcFirstLastPara="0" vertOverflow="overflow" horzOverflow="overflow" vert="horz" wrap="square" lIns="91440" tIns="45720" rIns="91440" bIns="45720" numCol="1" spcCol="0" rtlCol="0" fromWordArt="0" anchor="t" anchorCtr="0" forceAA="0" compatLnSpc="1">
+                        <a:prstTxWarp prst="textNoShape">
+                          <a:avLst/>
+                        </a:prstTxWarp>
+                        <a:noAutofit/>
+                      </wps:bodyPr>
+                    </wps:wsp>
+                  </a:graphicData>
+                </a:graphic>
+                <wp14:sizeRelH relativeFrom="margin">
+                  <wp14:pctWidth>0</wp14:pctWidth>
+                </wp14:sizeRelH>
+                <wp14:sizeRelV relativeFrom="margin">
+                  <wp14:pctHeight>0</wp14:pctHeight>
+                </wp14:sizeRelV>
+              </wp:anchor>
+            </w:drawing>
+          </mc:Choice>
+          <mc:Fallback>
+            <w:pict>
+              <v:shape id="Text Box 4" o:spid="_x0000_s1029" type="#_x0000_t202" style="position:absolute;margin-left:130.5pt;margin-top:231.75pt;width:19.5pt;height:18pt;z-index:251663360;visibility:visible;mso-wrap-style:square;mso-width-percent:0;mso-height-percent:0;mso-wrap-distance-left:9pt;mso-wrap-distance-top:0;mso-wrap-distance-right:9pt;mso-wrap-distance-bottom:0;mso-position-horizontal:absolute;mso-position-horizontal-relative:text;mso-position-vertical:absolute;mso-position-vertical-relative:text;mso-width-percent:0;mso-height-percent:0;mso-width-relative:margin;mso-height-relative:margin;v-text-anchor:top" o:gfxdata="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" fillcolor="white [3201]" strokecolor="white [3212]" strokeweight=".5pt">
+                <v:textbox>
+                  <w:txbxContent>
+                    <w:p>
+                      <w:pPr>
+                        <w:jc w:val="center"/>
+                      </w:pPr>
+                      <w:r>
+                        <w:t>1</w:t>
+                      </w:r>
+                    </w:p>
+                  </w:txbxContent>
+                </v:textbox>
+              </v:shape>
+            </w:pict>
+          </mc:Fallback>
+        </mc:AlternateContent>
+      </w:r>
+      <w:r>
+        <w:rPr>
+          <w:noProof/>
+        </w:rPr>
         <w:drawing>
-          <wp:inline distT="0" distB="0" distL="0" distR="0" wp14:anchorId="2D6758FA" wp14:editId="70CD3387">
+          <wp:inline distT="0" distB="0" distL="0" distR="0" wp14:anchorId="2D6758FA" wp14:editId="5EEBC61F">
             <wp:extent cx="8863965" cy="4831790"/>
             <wp:effectExtent l="0" t="0" r="0" b="6985"/>
             <wp:docPr id="18" name="Picture 18" descr="C:\Users\Brandon\Documents\uml.png"/>
@@ -2297,11 +3516,11 @@
       <w:pPr>
         <w:pStyle w:val="Heading2"/>
       </w:pPr>
-      <w:bookmarkStart w:id="9" w:name="_Toc236216662"/>
+      <w:bookmarkStart w:id="10" w:name="_Toc238036131"/>
       <w:r>
         <w:t>ERD Explanation</w:t>
       </w:r>
-      <w:bookmarkEnd w:id="9"/>
+      <w:bookmarkEnd w:id="10"/>
     </w:p>
     <w:p>
       <w:pPr>
@@ -2310,19 +3529,11 @@
       <w:r>
         <w:t xml:space="preserve">The Entity Relationship Diagram (ERD) illustrates the database structure of the </w:t>
       </w:r>
-      <w:proofErr w:type="spellStart"/>
       <w:r>
         <w:rPr>
           <w:rStyle w:val="Strong"/>
         </w:rPr>
-        <w:t>InternFlow</w:t>
-      </w:r>
-      <w:proofErr w:type="spellEnd"/>
-      <w:r>
-        <w:rPr>
-          <w:rStyle w:val="Strong"/>
-        </w:rPr>
-        <w:t xml:space="preserve"> Internship Management System</w:t>
+        <w:t>InternFlow Internship Management System</w:t>
       </w:r>
       <w:r>
         <w:t xml:space="preserve">. The </w:t>
@@ -2626,7 +3837,7 @@
           <w:szCs w:val="24"/>
         </w:rPr>
       </w:pPr>
-      <w:bookmarkStart w:id="10" w:name="_Toc236216663"/>
+      <w:bookmarkStart w:id="11" w:name="_Toc238036132"/>
       <w:r>
         <w:rPr>
           <w:rStyle w:val="Heading3Char"/>
@@ -2641,7 +3852,7 @@
         </w:rPr>
         <w:t>HTML</w:t>
       </w:r>
-      <w:bookmarkEnd w:id="10"/>
+      <w:bookmarkEnd w:id="11"/>
       <w:r>
         <w:rPr>
           <w:rFonts w:ascii="Times New Roman" w:hAnsi="Times New Roman" w:cs="Times New Roman"/>
@@ -2749,7 +3960,7 @@
         <w:spacing w:line="360" w:lineRule="auto"/>
         <w:ind w:firstLine="720"/>
       </w:pPr>
-      <w:bookmarkStart w:id="11" w:name="_Toc236216664"/>
+      <w:bookmarkStart w:id="12" w:name="_Toc238036133"/>
       <w:r>
         <w:rPr>
           <w:rStyle w:val="Heading3Char"/>
@@ -2764,7 +3975,7 @@
         </w:rPr>
         <w:t>CSS</w:t>
       </w:r>
-      <w:bookmarkEnd w:id="11"/>
+      <w:bookmarkEnd w:id="12"/>
       <w:r>
         <w:rPr>
           <w:rFonts w:ascii="Times New Roman" w:hAnsi="Times New Roman" w:cs="Times New Roman"/>
@@ -2809,7 +4020,6 @@
           <w:sz w:val="24"/>
           <w:szCs w:val="24"/>
         </w:rPr>
-        <w:lastRenderedPageBreak/>
         <w:t xml:space="preserve">  </w:t>
       </w:r>
       <w:r>
@@ -2878,12 +4088,13 @@
           <w:szCs w:val="24"/>
         </w:rPr>
       </w:pPr>
-      <w:bookmarkStart w:id="12" w:name="_Toc236216665"/>
+      <w:bookmarkStart w:id="13" w:name="_Toc238036134"/>
       <w:r>
         <w:rPr>
           <w:rStyle w:val="Heading3Char"/>
           <w:sz w:val="24"/>
         </w:rPr>
+        <w:lastRenderedPageBreak/>
         <w:t xml:space="preserve">1.4 </w:t>
       </w:r>
       <w:r>
@@ -2893,7 +4104,7 @@
         </w:rPr>
         <w:t>JavaScript</w:t>
       </w:r>
-      <w:bookmarkEnd w:id="12"/>
+      <w:bookmarkEnd w:id="13"/>
       <w:r>
         <w:rPr>
           <w:sz w:val="24"/>
@@ -3023,7 +4234,7 @@
           <w:szCs w:val="24"/>
         </w:rPr>
       </w:pPr>
-      <w:bookmarkStart w:id="13" w:name="_Toc236216666"/>
+      <w:bookmarkStart w:id="14" w:name="_Toc238036135"/>
       <w:r>
         <w:rPr>
           <w:rStyle w:val="Heading3Char"/>
@@ -3031,7 +4242,6 @@
         </w:rPr>
         <w:t xml:space="preserve">1.5 </w:t>
       </w:r>
-      <w:proofErr w:type="spellStart"/>
       <w:r>
         <w:rPr>
           <w:rStyle w:val="Heading3Char"/>
@@ -3039,8 +4249,7 @@
         </w:rPr>
         <w:t>IndexedDB</w:t>
       </w:r>
-      <w:bookmarkEnd w:id="13"/>
-      <w:proofErr w:type="spellEnd"/>
+      <w:bookmarkEnd w:id="14"/>
       <w:r>
         <w:rPr>
           <w:rFonts w:ascii="Times New Roman" w:hAnsi="Times New Roman" w:cs="Times New Roman"/>
@@ -3133,7 +4342,7 @@
           <w:sz w:val="24"/>
         </w:rPr>
       </w:pPr>
-      <w:bookmarkStart w:id="14" w:name="_Toc236216667"/>
+      <w:bookmarkStart w:id="15" w:name="_Toc238036136"/>
       <w:r>
         <w:rPr>
           <w:sz w:val="24"/>
@@ -3152,7 +4361,7 @@
         </w:rPr>
         <w:t>:</w:t>
       </w:r>
-      <w:bookmarkEnd w:id="14"/>
+      <w:bookmarkEnd w:id="15"/>
     </w:p>
     <w:p>
       <w:pPr>
@@ -3228,17 +4437,133 @@
     </w:p>
     <w:p>
       <w:pPr>
+        <w:pStyle w:val="Heading3"/>
+        <w:ind w:firstLine="720"/>
+        <w:rPr>
+          <w:sz w:val="24"/>
+        </w:rPr>
+      </w:pPr>
+      <w:bookmarkStart w:id="16" w:name="_Toc238036137"/>
+      <w:r>
+        <w:rPr>
+          <w:sz w:val="24"/>
+        </w:rPr>
+        <w:t xml:space="preserve">1.7 </w:t>
+      </w:r>
+      <w:proofErr w:type="spellStart"/>
+      <w:r>
+        <w:rPr>
+          <w:sz w:val="24"/>
+        </w:rPr>
+        <w:t>Git</w:t>
+      </w:r>
+      <w:proofErr w:type="spellEnd"/>
+      <w:r>
+        <w:rPr>
+          <w:sz w:val="24"/>
+        </w:rPr>
+        <w:t xml:space="preserve"> &amp; GitHub</w:t>
+      </w:r>
+      <w:r>
+        <w:rPr>
+          <w:sz w:val="24"/>
+        </w:rPr>
+        <w:t>:</w:t>
+      </w:r>
+      <w:bookmarkEnd w:id="16"/>
+    </w:p>
+    <w:p>
+      <w:r>
+        <w:rPr>
+          <w:rFonts w:ascii="Times New Roman" w:hAnsi="Times New Roman" w:cs="Times New Roman"/>
+        </w:rPr>
+        <w:tab/>
+        <w:t xml:space="preserve">GitHub </w:t>
+      </w:r>
+      <w:r>
+        <w:t xml:space="preserve">Provides virtual storage and space for collaboration within our team and synchronizes our workflow with simple </w:t>
+      </w:r>
+      <w:proofErr w:type="spellStart"/>
+      <w:r>
+        <w:t>Git</w:t>
+      </w:r>
+      <w:proofErr w:type="spellEnd"/>
+      <w:r>
+        <w:t xml:space="preserve"> commands</w:t>
+      </w:r>
+    </w:p>
+    <w:p>
+      <w:r>
+        <w:tab/>
+      </w:r>
+      <w:r>
+        <w:rPr>
+          <w:noProof/>
+        </w:rPr>
+        <w:drawing>
+          <wp:inline distT="0" distB="0" distL="0" distR="0" wp14:anchorId="0147424D" wp14:editId="0F14FCD2">
+            <wp:extent cx="1459798" cy="819150"/>
+            <wp:effectExtent l="0" t="0" r="7620" b="0"/>
+            <wp:docPr id="9" name="Picture 9" descr="GitHub - shahzaneer/Git-and-Github-Fundamentals: All about Git Version Controlling System and GitHub the web based git-repositories hosting platform · GitHub"/>
+            <wp:cNvGraphicFramePr>
+              <a:graphicFrameLocks xmlns:a="http://schemas.openxmlformats.org/drawingml/2006/main" noChangeAspect="1"/>
+            </wp:cNvGraphicFramePr>
+            <a:graphic xmlns:a="http://schemas.openxmlformats.org/drawingml/2006/main">
+              <a:graphicData uri="http://schemas.openxmlformats.org/drawingml/2006/picture">
+                <pic:pic xmlns:pic="http://schemas.openxmlformats.org/drawingml/2006/picture">
+                  <pic:nvPicPr>
+                    <pic:cNvPr id="0" name="Picture 2" descr="GitHub - shahzaneer/Git-and-Github-Fundamentals: All about Git Version Controlling System and GitHub the web based git-repositories hosting platform · GitHub"/>
+                    <pic:cNvPicPr>
+                      <a:picLocks noChangeAspect="1" noChangeArrowheads="1"/>
+                    </pic:cNvPicPr>
+                  </pic:nvPicPr>
+                  <pic:blipFill>
+                    <a:blip r:embed="rId21" cstate="print">
+                      <a:extLst>
+                        <a:ext uri="{28A0092B-C50C-407E-A947-70E740481C1C}">
+                          <a14:useLocalDpi xmlns:a14="http://schemas.microsoft.com/office/drawing/2010/main" val="0"/>
+                        </a:ext>
+                      </a:extLst>
+                    </a:blip>
+                    <a:srcRect/>
+                    <a:stretch>
+                      <a:fillRect/>
+                    </a:stretch>
+                  </pic:blipFill>
+                  <pic:spPr bwMode="auto">
+                    <a:xfrm>
+                      <a:off x="0" y="0"/>
+                      <a:ext cx="1459798" cy="819150"/>
+                    </a:xfrm>
+                    <a:prstGeom prst="rect">
+                      <a:avLst/>
+                    </a:prstGeom>
+                    <a:noFill/>
+                    <a:ln>
+                      <a:noFill/>
+                    </a:ln>
+                  </pic:spPr>
+                </pic:pic>
+              </a:graphicData>
+            </a:graphic>
+          </wp:inline>
+        </w:drawing>
+      </w:r>
+    </w:p>
+    <w:p>
+      <w:pPr>
         <w:pStyle w:val="Heading1"/>
         <w:spacing w:line="360" w:lineRule="auto"/>
       </w:pPr>
-      <w:bookmarkStart w:id="15" w:name="_Toc236216668"/>
-      <w:r>
+      <w:bookmarkStart w:id="17" w:name="_Toc238036138"/>
+      <w:r>
+        <w:lastRenderedPageBreak/>
         <w:t>Appendices</w:t>
       </w:r>
-      <w:bookmarkEnd w:id="15"/>
       <w:r>
         <w:t>:</w:t>
       </w:r>
+      <w:bookmarkEnd w:id="17"/>
     </w:p>
     <w:p>
       <w:pPr>
@@ -3273,7 +4598,7 @@
                     <pic:cNvPicPr/>
                   </pic:nvPicPr>
                   <pic:blipFill>
-                    <a:blip r:embed="rId21"/>
+                    <a:blip r:embed="rId22"/>
                     <a:stretch>
                       <a:fillRect/>
                     </a:stretch>
@@ -3299,14 +4624,13 @@
         <w:pStyle w:val="Heading2"/>
       </w:pPr>
       <w:r>
-        <w:lastRenderedPageBreak/>
         <w:t xml:space="preserve"> </w:t>
       </w:r>
-      <w:bookmarkStart w:id="16" w:name="_Toc236216669"/>
+      <w:bookmarkStart w:id="18" w:name="_Toc238036139"/>
       <w:r>
         <w:t>Fig 1:</w:t>
       </w:r>
-      <w:bookmarkEnd w:id="16"/>
+      <w:bookmarkEnd w:id="18"/>
       <w:r>
         <w:t xml:space="preserve"> </w:t>
       </w:r>
@@ -3358,7 +4682,7 @@
                     <pic:cNvPicPr/>
                   </pic:nvPicPr>
                   <pic:blipFill>
-                    <a:blip r:embed="rId22"/>
+                    <a:blip r:embed="rId23"/>
                     <a:stretch>
                       <a:fillRect/>
                     </a:stretch>
@@ -3383,11 +4707,11 @@
       <w:pPr>
         <w:pStyle w:val="Heading2"/>
       </w:pPr>
-      <w:bookmarkStart w:id="17" w:name="_Toc236216670"/>
+      <w:bookmarkStart w:id="19" w:name="_Toc238036140"/>
       <w:r>
         <w:t>Fig 2:</w:t>
       </w:r>
-      <w:bookmarkEnd w:id="17"/>
+      <w:bookmarkEnd w:id="19"/>
       <w:r>
         <w:t xml:space="preserve"> </w:t>
       </w:r>
@@ -3452,6 +4776,7 @@
           <w:noProof/>
           <w:sz w:val="24"/>
         </w:rPr>
+        <w:lastRenderedPageBreak/>
         <w:drawing>
           <wp:inline distT="0" distB="0" distL="0" distR="0" wp14:anchorId="1F15EFF0" wp14:editId="7604726F">
             <wp:extent cx="8863965" cy="4217035"/>
@@ -3468,7 +4793,7 @@
                     <pic:cNvPicPr/>
                   </pic:nvPicPr>
                   <pic:blipFill>
-                    <a:blip r:embed="rId23"/>
+                    <a:blip r:embed="rId24"/>
                     <a:stretch>
                       <a:fillRect/>
                     </a:stretch>
@@ -3493,11 +4818,11 @@
       <w:pPr>
         <w:pStyle w:val="Heading2"/>
       </w:pPr>
-      <w:bookmarkStart w:id="18" w:name="_Toc236216671"/>
+      <w:bookmarkStart w:id="20" w:name="_Toc238036141"/>
       <w:r>
         <w:t>Fig 3:</w:t>
       </w:r>
-      <w:bookmarkEnd w:id="18"/>
+      <w:bookmarkEnd w:id="20"/>
     </w:p>
     <w:p>
       <w:pPr>
@@ -3556,7 +4881,6 @@
           <w:sz w:val="24"/>
           <w:szCs w:val="24"/>
         </w:rPr>
-        <w:lastRenderedPageBreak/>
         <w:drawing>
           <wp:inline distT="0" distB="0" distL="0" distR="0" wp14:anchorId="62CC22B9" wp14:editId="4BB84C83">
             <wp:extent cx="8863965" cy="4189095"/>
@@ -3573,7 +4897,7 @@
                     <pic:cNvPicPr/>
                   </pic:nvPicPr>
                   <pic:blipFill>
-                    <a:blip r:embed="rId24"/>
+                    <a:blip r:embed="rId25"/>
                     <a:stretch>
                       <a:fillRect/>
                     </a:stretch>
@@ -3598,11 +4922,11 @@
       <w:pPr>
         <w:pStyle w:val="Heading2"/>
       </w:pPr>
-      <w:bookmarkStart w:id="19" w:name="_Toc236216672"/>
+      <w:bookmarkStart w:id="21" w:name="_Toc238036142"/>
       <w:r>
         <w:t>Fig 4:</w:t>
       </w:r>
-      <w:bookmarkEnd w:id="19"/>
+      <w:bookmarkEnd w:id="21"/>
       <w:r>
         <w:t xml:space="preserve"> </w:t>
       </w:r>
@@ -3623,6 +4947,10 @@
     <w:p/>
     <w:p>
       <w:r>
+        <w:rPr>
+          <w:noProof/>
+        </w:rPr>
+        <w:lastRenderedPageBreak/>
         <w:drawing>
           <wp:inline distT="0" distB="0" distL="0" distR="0" wp14:anchorId="4DEA5A33" wp14:editId="2C3BD56D">
             <wp:extent cx="8867775" cy="4214088"/>
@@ -3639,7 +4967,7 @@
                     <pic:cNvPicPr/>
                   </pic:nvPicPr>
                   <pic:blipFill>
-                    <a:blip r:embed="rId25"/>
+                    <a:blip r:embed="rId26"/>
                     <a:stretch>
                       <a:fillRect/>
                     </a:stretch>
@@ -3659,19 +4987,17 @@
           </wp:inline>
         </w:drawing>
       </w:r>
-      <w:bookmarkStart w:id="20" w:name="_GoBack"/>
-      <w:bookmarkEnd w:id="20"/>
     </w:p>
     <w:p/>
     <w:p>
       <w:pPr>
         <w:pStyle w:val="Heading2"/>
       </w:pPr>
-      <w:bookmarkStart w:id="21" w:name="_Toc236216673"/>
+      <w:bookmarkStart w:id="22" w:name="_Toc238036143"/>
       <w:r>
         <w:t>Fig 5:</w:t>
       </w:r>
-      <w:bookmarkEnd w:id="21"/>
+      <w:bookmarkEnd w:id="22"/>
       <w:r>
         <w:t xml:space="preserve"> </w:t>
       </w:r>
@@ -3695,7 +5021,6 @@
         <w:rPr>
           <w:noProof/>
         </w:rPr>
-        <w:lastRenderedPageBreak/>
         <w:drawing>
           <wp:inline distT="0" distB="0" distL="0" distR="0" wp14:anchorId="541C4D3C" wp14:editId="35303D02">
             <wp:extent cx="8863965" cy="4235450"/>
@@ -3712,7 +5037,7 @@
                     <pic:cNvPicPr/>
                   </pic:nvPicPr>
                   <pic:blipFill>
-                    <a:blip r:embed="rId26"/>
+                    <a:blip r:embed="rId27"/>
                     <a:stretch>
                       <a:fillRect/>
                     </a:stretch>
@@ -3737,11 +5062,11 @@
       <w:pPr>
         <w:pStyle w:val="Heading2"/>
       </w:pPr>
-      <w:bookmarkStart w:id="22" w:name="_Toc236216674"/>
+      <w:bookmarkStart w:id="23" w:name="_Toc238036144"/>
       <w:r>
         <w:t>Fig 6:</w:t>
       </w:r>
-      <w:bookmarkEnd w:id="22"/>
+      <w:bookmarkEnd w:id="23"/>
       <w:r>
         <w:t xml:space="preserve"> </w:t>
       </w:r>
@@ -3765,6 +5090,7 @@
         <w:rPr>
           <w:noProof/>
         </w:rPr>
+        <w:lastRenderedPageBreak/>
         <w:drawing>
           <wp:inline distT="0" distB="0" distL="0" distR="0" wp14:anchorId="6D38A46C" wp14:editId="3108C277">
             <wp:extent cx="8924342" cy="4752975"/>
@@ -3781,7 +5107,7 @@
                     <pic:cNvPicPr/>
                   </pic:nvPicPr>
                   <pic:blipFill>
-                    <a:blip r:embed="rId27"/>
+                    <a:blip r:embed="rId28"/>
                     <a:stretch>
                       <a:fillRect/>
                     </a:stretch>
@@ -3806,11 +5132,11 @@
       <w:pPr>
         <w:pStyle w:val="Heading2"/>
       </w:pPr>
-      <w:bookmarkStart w:id="23" w:name="_Toc236216675"/>
+      <w:bookmarkStart w:id="24" w:name="_Toc238036145"/>
       <w:r>
         <w:t>Fig 7:</w:t>
       </w:r>
-      <w:bookmarkEnd w:id="23"/>
+      <w:bookmarkEnd w:id="24"/>
       <w:r>
         <w:t xml:space="preserve"> </w:t>
       </w:r>
@@ -3864,17 +5190,17 @@
         <w:pStyle w:val="Heading1"/>
         <w:spacing w:line="360" w:lineRule="auto"/>
       </w:pPr>
-      <w:bookmarkStart w:id="24" w:name="_Toc236216676"/>
     </w:p>
     <w:p>
       <w:pPr>
         <w:pStyle w:val="Heading1"/>
         <w:spacing w:line="360" w:lineRule="auto"/>
       </w:pPr>
+      <w:bookmarkStart w:id="25" w:name="_Toc238036146"/>
       <w:r>
         <w:t>CONCLUSION:</w:t>
       </w:r>
-      <w:bookmarkEnd w:id="24"/>
+      <w:bookmarkEnd w:id="25"/>
     </w:p>
     <w:p>
       <w:pPr>
@@ -3889,35 +5215,7 @@
         <w:rPr>
           <w:rFonts w:ascii="Times New Roman" w:hAnsi="Times New Roman" w:cs="Times New Roman"/>
         </w:rPr>
-        <w:t xml:space="preserve">In conclusion, this project shows that a full internship management system can be built using only client-side technologies, with no server required. By combining UML design with </w:t>
-      </w:r>
-      <w:proofErr w:type="spellStart"/>
-      <w:r>
-        <w:rPr>
-          <w:rFonts w:ascii="Times New Roman" w:hAnsi="Times New Roman" w:cs="Times New Roman"/>
-        </w:rPr>
-        <w:t>IndexedDB</w:t>
-      </w:r>
-      <w:proofErr w:type="spellEnd"/>
-      <w:r>
-        <w:rPr>
-          <w:rFonts w:ascii="Times New Roman" w:hAnsi="Times New Roman" w:cs="Times New Roman"/>
-        </w:rPr>
-        <w:t xml:space="preserve"> — the browser's built-in database — </w:t>
-      </w:r>
-      <w:proofErr w:type="spellStart"/>
-      <w:r>
-        <w:rPr>
-          <w:rFonts w:ascii="Times New Roman" w:hAnsi="Times New Roman" w:cs="Times New Roman"/>
-        </w:rPr>
-        <w:t>InternFlow</w:t>
-      </w:r>
-      <w:proofErr w:type="spellEnd"/>
-      <w:r>
-        <w:rPr>
-          <w:rFonts w:ascii="Times New Roman" w:hAnsi="Times New Roman" w:cs="Times New Roman"/>
-        </w:rPr>
-        <w:t xml:space="preserve"> offers fast performance, zero hosting costs, and complete data privacy, since all data stays on the user's device. Administrators can register interns, generate credentials, and process attendance records quickly and reliably, even without an internet connection. This project proves that powerful, secure, and scalable internship management tools can be built directly into the browser, opening the door for future upgrades like offline tracking, performance evaluation, </w:t>
+        <w:t xml:space="preserve">In conclusion, this project shows that a full internship management system can be built using only client-side technologies, with no server required. By combining UML design with IndexedDB — the browser's built-in database — InternFlow offers fast performance, zero hosting costs, and complete data privacy, since all data stays on the user's device. Administrators can register interns, generate credentials, and process attendance records quickly and reliably, even without an internet connection. This project proves that powerful, secure, and scalable internship management tools can be built directly into the browser, opening the door for future upgrades like offline tracking, performance evaluation, </w:t>
       </w:r>
       <w:proofErr w:type="gramStart"/>
       <w:r>
@@ -6853,7 +8151,7 @@
   <w:style w:type="paragraph" w:default="1" w:styleId="Normal">
     <w:name w:val="Normal"/>
     <w:qFormat/>
-    <w:rsid w:val="003106C8"/>
+    <w:rsid w:val="008F5CFC"/>
   </w:style>
   <w:style w:type="paragraph" w:styleId="Heading1">
     <w:name w:val="heading 1"/>
@@ -6995,6 +8293,7 @@
     <w:autoRedefine/>
     <w:uiPriority w:val="39"/>
     <w:unhideWhenUsed/>
+    <w:rsid w:val="00AD2DD9"/>
     <w:pPr>
       <w:tabs>
         <w:tab w:val="right" w:leader="dot" w:pos="9350"/>
@@ -7503,7 +8802,7 @@
   <w:style w:type="paragraph" w:default="1" w:styleId="Normal">
     <w:name w:val="Normal"/>
     <w:qFormat/>
-    <w:rsid w:val="003106C8"/>
+    <w:rsid w:val="008F5CFC"/>
   </w:style>
   <w:style w:type="paragraph" w:styleId="Heading1">
     <w:name w:val="heading 1"/>
@@ -7645,6 +8944,7 @@
     <w:autoRedefine/>
     <w:uiPriority w:val="39"/>
     <w:unhideWhenUsed/>
+    <w:rsid w:val="00AD2DD9"/>
     <w:pPr>
       <w:tabs>
         <w:tab w:val="right" w:leader="dot" w:pos="9350"/>
@@ -8284,7 +9584,7 @@
 </file>
 
 <file path=customXml/itemProps1.xml><?xml version="1.0" encoding="utf-8"?>
-<ds:datastoreItem xmlns:ds="http://schemas.openxmlformats.org/officeDocument/2006/customXml" ds:itemID="{61E11808-D466-4B3C-91A0-B9348FD3897B}">
+<ds:datastoreItem xmlns:ds="http://schemas.openxmlformats.org/officeDocument/2006/customXml" ds:itemID="{E9FA657C-BB28-4833-AAAA-53E61479DE8F}">
   <ds:schemaRefs>
     <ds:schemaRef ds:uri="http://schemas.openxmlformats.org/officeDocument/2006/bibliography"/>
   </ds:schemaRefs>

</xml_diff>